<commit_message>
Deploying to gh-pages from @ Morrison-Lab/psw@9a58ee5e3a2802a12c677d6b5a7d79d8b933c79c 🚀
</commit_message>
<xml_diff>
--- a/chapters/mathematical-writing.docx
+++ b/chapters/mathematical-writing.docx
@@ -15,7 +15,7 @@
         <w:pStyle w:val="Date"/>
       </w:pPr>
       <w:r>
-        <w:t xml:space="preserve">Last modified: 2026-10-18 13:23:31 (PDT)</w:t>
+        <w:t xml:space="preserve">Last modified: 2026-10-18 14:45:14 (PDT)</w:t>
       </w:r>
     </w:p>
     <w:tbl>
@@ -222,7 +222,7 @@
         <w:t xml:space="preserve">The notes also cover spelling, punctuation and refereeing, which this book does not.</w:t>
       </w:r>
     </w:p>
-    <w:bookmarkStart w:id="19" w:name="keep-formulas-inside-sentences"/>
+    <w:bookmarkStart w:id="23" w:name="keep-formulas-inside-sentences"/>
     <w:p>
       <w:pPr>
         <w:pStyle w:val="Heading2"/>
@@ -779,14 +779,13 @@
       </w:r>
     </w:p>
     <w:bookmarkEnd w:id="18"/>
-    <w:bookmarkEnd w:id="19"/>
-    <w:bookmarkStart w:id="21" w:name="introduce-a-theorem-with-a-sentence"/>
-    <w:p>
-      <w:pPr>
-        <w:pStyle w:val="Heading2"/>
-      </w:pPr>
-      <w:r>
-        <w:t xml:space="preserve">2 Introduce a theorem with a sentence</w:t>
+    <w:bookmarkStart w:id="22" w:name="make-the-prose-say-what-the-formula-says"/>
+    <w:p>
+      <w:pPr>
+        <w:pStyle w:val="Heading3"/>
+      </w:pPr>
+      <w:r>
+        <w:t xml:space="preserve">1.6 Make the prose say what the formula says</w:t>
       </w:r>
     </w:p>
     <w:p>
@@ -794,34 +793,28 @@
         <w:pStyle w:val="FirstParagraph"/>
       </w:pPr>
       <w:r>
-        <w:t xml:space="preserve">The line before a theorem, lemma or algorithm should be a complete sentence,</w:t>
-      </w:r>
-      <w:r>
-        <w:t xml:space="preserve"> </w:t>
-      </w:r>
-      <w:r>
-        <w:t xml:space="preserve">or end with a colon.</w:t>
-      </w:r>
-      <w:r>
-        <w:t xml:space="preserve"> </w:t>
-      </w:r>
-      <w:r>
-        <w:t xml:space="preserve">Do not let a heading such as</w:t>
-      </w:r>
-      <w:r>
-        <w:t xml:space="preserve"> </w:t>
-      </w:r>
-      <w:r>
-        <w:t xml:space="preserve">“Theorem”</w:t>
-      </w:r>
-      <w:r>
-        <w:t xml:space="preserve"> </w:t>
-      </w:r>
-      <w:r>
-        <w:t xml:space="preserve">finish a sentence that began above it.</w:t>
-      </w:r>
-    </w:p>
-    <w:bookmarkStart w:id="20" w:name="exm-introduce-theorem"/>
+        <w:t xml:space="preserve">The sentence that introduces or interprets a formula must describe that formula.</w:t>
+      </w:r>
+      <w:r>
+        <w:t xml:space="preserve"> </w:t>
+      </w:r>
+      <w:r>
+        <w:t xml:space="preserve">Check every term in the sentence against the formula, symbol by symbol.</w:t>
+      </w:r>
+      <w:r>
+        <w:t xml:space="preserve"> </w:t>
+      </w:r>
+      <w:r>
+        <w:t xml:space="preserve">The words and the symbols must name the same quantity, the same data, and the same kind of average.</w:t>
+      </w:r>
+      <w:r>
+        <w:t xml:space="preserve"> </w:t>
+      </w:r>
+      <w:r>
+        <w:t xml:space="preserve">When you change one, change the other in the same edit.</w:t>
+      </w:r>
+    </w:p>
+    <w:bookmarkStart w:id="19" w:name="exm-prose-matches-math"/>
     <w:p>
       <w:pPr>
         <w:pStyle w:val="BodyText"/>
@@ -831,7 +824,190 @@
           <w:b/>
           <w:bCs/>
         </w:rPr>
-        <w:t xml:space="preserve">Example 3 (Introducing a theorem)</w:t>
+        <w:t xml:space="preserve">Example 3 (A sentence that names the wrong average)</w:t>
+      </w:r>
+      <w:r>
+        <w:t xml:space="preserve"> </w:t>
+      </w:r>
+      <w:r>
+        <w:t xml:space="preserve">Suppose the formula is</w:t>
+      </w:r>
+      <w:r>
+        <w:t xml:space="preserve"> </w:t>
+      </w:r>
+      <w:r>
+        <w:t xml:space="preserve">$\E{\paren{\newoutvar - \predvalf{\predvar}}^2}$</w:t>
+      </w:r>
+      <w:r>
+        <w:t xml:space="preserve">, a population mean at one covariate value</w:t>
+      </w:r>
+      <w:r>
+        <w:t xml:space="preserve"> </w:t>
+      </w:r>
+      <w:r>
+        <w:t xml:space="preserve">$\predvar$</w:t>
+      </w:r>
+      <w:r>
+        <w:t xml:space="preserve">.</w:t>
+      </w:r>
+      <w:r>
+        <w:t xml:space="preserve"> </w:t>
+      </w:r>
+      <w:r>
+        <w:t xml:space="preserve">The sentence</w:t>
+      </w:r>
+      <w:r>
+        <w:t xml:space="preserve"> </w:t>
+      </w:r>
+      <w:r>
+        <w:t xml:space="preserve">“the average squared error over the training set”</w:t>
+      </w:r>
+      <w:r>
+        <w:t xml:space="preserve"> </w:t>
+      </w:r>
+      <w:r>
+        <w:t xml:space="preserve">does not describe it.</w:t>
+      </w:r>
+      <w:r>
+        <w:t xml:space="preserve"> </w:t>
+      </w:r>
+      <w:r>
+        <w:t xml:space="preserve">It names a sample average over many observations.</w:t>
+      </w:r>
+      <w:r>
+        <w:t xml:space="preserve"> </w:t>
+      </w:r>
+      <w:r>
+        <w:t xml:space="preserve">Write</w:t>
+      </w:r>
+      <w:r>
+        <w:t xml:space="preserve"> </w:t>
+      </w:r>
+      <w:r>
+        <w:t xml:space="preserve">“the expected squared prediction error at</w:t>
+      </w:r>
+      <w:r>
+        <w:t xml:space="preserve"> </w:t>
+      </w:r>
+      <w:r>
+        <w:t xml:space="preserve">$\predvar$</w:t>
+      </w:r>
+      <w:r>
+        <w:t xml:space="preserve">”</w:t>
+      </w:r>
+      <w:r>
+        <w:t xml:space="preserve"> </w:t>
+      </w:r>
+      <w:r>
+        <w:t xml:space="preserve">instead.</w:t>
+      </w:r>
+    </w:p>
+    <w:bookmarkEnd w:id="19"/>
+    <w:p>
+      <w:pPr>
+        <w:pStyle w:val="BodyText"/>
+      </w:pPr>
+      <w:r>
+        <w:t xml:space="preserve">Before you submit, reread each formula next to the sentence that describes it.</w:t>
+      </w:r>
+      <w:r>
+        <w:t xml:space="preserve"> </w:t>
+      </w:r>
+      <w:r>
+        <w:t xml:space="preserve">Do the same after every edit to either one.</w:t>
+      </w:r>
+      <w:r>
+        <w:t xml:space="preserve"> </w:t>
+      </w:r>
+      <w:r>
+        <w:t xml:space="preserve">Related rules cover</w:t>
+      </w:r>
+      <w:r>
+        <w:t xml:space="preserve"> </w:t>
+      </w:r>
+      <w:hyperlink r:id="rId20">
+        <w:r>
+          <w:rPr>
+            <w:rStyle w:val="Hyperlink"/>
+          </w:rPr>
+          <w:t xml:space="preserve">using one notation for one thing</w:t>
+        </w:r>
+      </w:hyperlink>
+      <w:r>
+        <w:t xml:space="preserve"> </w:t>
+      </w:r>
+      <w:r>
+        <w:t xml:space="preserve">and</w:t>
+      </w:r>
+      <w:r>
+        <w:t xml:space="preserve"> </w:t>
+      </w:r>
+      <w:hyperlink r:id="rId21">
+        <w:r>
+          <w:rPr>
+            <w:rStyle w:val="Hyperlink"/>
+          </w:rPr>
+          <w:t xml:space="preserve">defining every variable when you introduce it</w:t>
+        </w:r>
+      </w:hyperlink>
+      <w:r>
+        <w:t xml:space="preserve">.</w:t>
+      </w:r>
+    </w:p>
+    <w:bookmarkEnd w:id="22"/>
+    <w:bookmarkEnd w:id="23"/>
+    <w:bookmarkStart w:id="25" w:name="introduce-a-theorem-with-a-sentence"/>
+    <w:p>
+      <w:pPr>
+        <w:pStyle w:val="Heading2"/>
+      </w:pPr>
+      <w:r>
+        <w:t xml:space="preserve">2 Introduce a theorem with a sentence</w:t>
+      </w:r>
+    </w:p>
+    <w:p>
+      <w:pPr>
+        <w:pStyle w:val="FirstParagraph"/>
+      </w:pPr>
+      <w:r>
+        <w:t xml:space="preserve">The line before a theorem, lemma or algorithm should be a complete sentence,</w:t>
+      </w:r>
+      <w:r>
+        <w:t xml:space="preserve"> </w:t>
+      </w:r>
+      <w:r>
+        <w:t xml:space="preserve">or end with a colon.</w:t>
+      </w:r>
+      <w:r>
+        <w:t xml:space="preserve"> </w:t>
+      </w:r>
+      <w:r>
+        <w:t xml:space="preserve">Do not let a heading such as</w:t>
+      </w:r>
+      <w:r>
+        <w:t xml:space="preserve"> </w:t>
+      </w:r>
+      <w:r>
+        <w:t xml:space="preserve">“Theorem”</w:t>
+      </w:r>
+      <w:r>
+        <w:t xml:space="preserve"> </w:t>
+      </w:r>
+      <w:r>
+        <w:t xml:space="preserve">finish a sentence that began above it.</w:t>
+      </w:r>
+    </w:p>
+    <w:bookmarkStart w:id="24" w:name="exm-introduce-theorem"/>
+    <w:p>
+      <w:pPr>
+        <w:pStyle w:val="BodyText"/>
+      </w:pPr>
+      <w:r>
+        <w:rPr>
+          <w:b/>
+          <w:bCs/>
+        </w:rPr>
+        <w:t xml:space="preserve">Example 4 (Introducing a theorem)</w:t>
       </w:r>
       <w:r>
         <w:t xml:space="preserve"> </w:t>
@@ -954,7 +1130,7 @@
         <w:t xml:space="preserve">The ✅ version uses a complete sentence, and the theorem names its object.</w:t>
       </w:r>
     </w:p>
-    <w:bookmarkEnd w:id="20"/>
+    <w:bookmarkEnd w:id="24"/>
     <w:p>
       <w:pPr>
         <w:pStyle w:val="BodyText"/>
@@ -975,8 +1151,8 @@
         <w:t xml:space="preserve">so repeat them in the statement.</w:t>
       </w:r>
     </w:p>
-    <w:bookmarkEnd w:id="21"/>
-    <w:bookmarkStart w:id="23" w:name="X635c8c263491261849c5951c600a7c8b3b0ab19"/>
+    <w:bookmarkEnd w:id="25"/>
+    <w:bookmarkStart w:id="27" w:name="X635c8c263491261849c5951c600a7c8b3b0ab19"/>
     <w:p>
       <w:pPr>
         <w:pStyle w:val="Heading2"/>
@@ -1013,7 +1189,7 @@
       <w:r>
         <w:t xml:space="preserve"> </w:t>
       </w:r>
-      <w:hyperlink r:id="rId22">
+      <w:hyperlink r:id="rId26">
         <w:r>
           <w:rPr>
             <w:rStyle w:val="Hyperlink"/>
@@ -1028,8 +1204,8 @@
         <w:t xml:space="preserve">number a display and let you link to it.</w:t>
       </w:r>
     </w:p>
-    <w:bookmarkEnd w:id="23"/>
-    <w:bookmarkStart w:id="24" w:name="Xa3cf6e4bc6fc8e3d4315c77eaadbd0b034cebd2"/>
+    <w:bookmarkEnd w:id="27"/>
+    <w:bookmarkStart w:id="28" w:name="Xa3cf6e4bc6fc8e3d4315c77eaadbd0b034cebd2"/>
     <w:p>
       <w:pPr>
         <w:pStyle w:val="Heading2"/>
@@ -1106,8 +1282,8 @@
         <w:t xml:space="preserve">.</w:t>
       </w:r>
     </w:p>
-    <w:bookmarkEnd w:id="24"/>
-    <w:bookmarkStart w:id="25" w:name="keep-subscripts-under-control"/>
+    <w:bookmarkEnd w:id="28"/>
+    <w:bookmarkStart w:id="29" w:name="keep-subscripts-under-control"/>
     <w:p>
       <w:pPr>
         <w:pStyle w:val="Heading2"/>
@@ -1433,8 +1609,8 @@
         <w:t xml:space="preserve">only when you need two specified elements.</w:t>
       </w:r>
     </w:p>
-    <w:bookmarkEnd w:id="25"/>
-    <w:bookmarkStart w:id="26" w:name="choose-the-voice-and-the-person"/>
+    <w:bookmarkEnd w:id="29"/>
+    <w:bookmarkStart w:id="30" w:name="choose-the-voice-and-the-person"/>
     <w:p>
       <w:pPr>
         <w:pStyle w:val="Heading2"/>
@@ -1656,8 +1832,8 @@
         <w:t xml:space="preserve">.</w:t>
       </w:r>
     </w:p>
-    <w:bookmarkEnd w:id="26"/>
-    <w:bookmarkStart w:id="27" w:name="choose-the-proof-that-fits-the-claim"/>
+    <w:bookmarkEnd w:id="30"/>
+    <w:bookmarkStart w:id="31" w:name="choose-the-proof-that-fits-the-claim"/>
     <w:p>
       <w:pPr>
         <w:pStyle w:val="Heading2"/>
@@ -1692,8 +1868,8 @@
         <w:t xml:space="preserve">and it does not assume that the entries are integers or restate their ordering.</w:t>
       </w:r>
     </w:p>
-    <w:bookmarkEnd w:id="27"/>
-    <w:bookmarkStart w:id="40" w:name="rules-that-other-chapters-cover"/>
+    <w:bookmarkEnd w:id="31"/>
+    <w:bookmarkStart w:id="42" w:name="rules-that-other-chapters-cover"/>
     <w:p>
       <w:pPr>
         <w:pStyle w:val="Heading2"/>
@@ -1734,7 +1910,7 @@
       <w:tr>
         <w:tc>
           <w:tcPr/>
-          <w:bookmarkStart w:id="36" w:name="tbl-knuth-elsewhere"/>
+          <w:bookmarkStart w:id="38" w:name="tbl-knuth-elsewhere"/>
           <w:p>
             <w:pPr>
               <w:jc w:val="center"/>
@@ -1808,7 +1984,7 @@
                     <w:pStyle w:val="Compact"/>
                     <w:jc w:val="center"/>
                   </w:pPr>
-                  <w:hyperlink r:id="rId28">
+                  <w:hyperlink r:id="rId21">
                     <w:r>
                       <w:rPr>
                         <w:rStyle w:val="Hyperlink"/>
@@ -1839,7 +2015,7 @@
                     <w:pStyle w:val="Compact"/>
                     <w:jc w:val="center"/>
                   </w:pPr>
-                  <w:hyperlink r:id="rId29">
+                  <w:hyperlink r:id="rId20">
                     <w:r>
                       <w:rPr>
                         <w:rStyle w:val="Hyperlink"/>
@@ -1870,7 +2046,7 @@
                     <w:pStyle w:val="Compact"/>
                     <w:jc w:val="center"/>
                   </w:pPr>
-                  <w:hyperlink r:id="rId30">
+                  <w:hyperlink r:id="rId32">
                     <w:r>
                       <w:rPr>
                         <w:rStyle w:val="Hyperlink"/>
@@ -1901,7 +2077,7 @@
                     <w:pStyle w:val="Compact"/>
                     <w:jc w:val="center"/>
                   </w:pPr>
-                  <w:hyperlink r:id="rId31">
+                  <w:hyperlink r:id="rId33">
                     <w:r>
                       <w:rPr>
                         <w:rStyle w:val="Hyperlink"/>
@@ -1932,7 +2108,7 @@
                     <w:pStyle w:val="Compact"/>
                     <w:jc w:val="center"/>
                   </w:pPr>
-                  <w:hyperlink r:id="rId32">
+                  <w:hyperlink r:id="rId34">
                     <w:r>
                       <w:rPr>
                         <w:rStyle w:val="Hyperlink"/>
@@ -1963,7 +2139,7 @@
                     <w:pStyle w:val="Compact"/>
                     <w:jc w:val="center"/>
                   </w:pPr>
-                  <w:hyperlink r:id="rId33">
+                  <w:hyperlink r:id="rId35">
                     <w:r>
                       <w:rPr>
                         <w:rStyle w:val="Hyperlink"/>
@@ -2018,7 +2194,7 @@
                     <w:pStyle w:val="Compact"/>
                     <w:jc w:val="center"/>
                   </w:pPr>
-                  <w:hyperlink r:id="rId34">
+                  <w:hyperlink r:id="rId36">
                     <w:r>
                       <w:rPr>
                         <w:rStyle w:val="Hyperlink"/>
@@ -2049,7 +2225,7 @@
                     <w:pStyle w:val="Compact"/>
                     <w:jc w:val="center"/>
                   </w:pPr>
-                  <w:hyperlink r:id="rId35">
+                  <w:hyperlink r:id="rId37">
                     <w:r>
                       <w:rPr>
                         <w:rStyle w:val="Hyperlink"/>
@@ -2061,13 +2237,13 @@
               </w:tc>
             </w:tr>
           </w:tbl>
-          <w:bookmarkEnd w:id="36"/>
+          <w:bookmarkEnd w:id="38"/>
           <w:p/>
         </w:tc>
       </w:tr>
     </w:tbl>
-    <w:bookmarkStart w:id="39" w:name="refs"/>
-    <w:bookmarkStart w:id="38" w:name="ref-knuth1987mathematical"/>
+    <w:bookmarkStart w:id="41" w:name="refs"/>
+    <w:bookmarkStart w:id="40" w:name="ref-knuth1987mathematical"/>
     <w:p>
       <w:pPr>
         <w:pStyle w:val="Bibliography"/>
@@ -2091,7 +2267,7 @@
       <w:r>
         <w:t xml:space="preserve"> </w:t>
       </w:r>
-      <w:hyperlink r:id="rId37">
+      <w:hyperlink r:id="rId39">
         <w:r>
           <w:rPr>
             <w:rStyle w:val="Hyperlink"/>
@@ -2103,9 +2279,9 @@
         <w:t xml:space="preserve">.</w:t>
       </w:r>
     </w:p>
-    <w:bookmarkEnd w:id="38"/>
-    <w:bookmarkEnd w:id="39"/>
     <w:bookmarkEnd w:id="40"/>
+    <w:bookmarkEnd w:id="41"/>
+    <w:bookmarkEnd w:id="42"/>
     <w:sectPr>
       <w:footnotePr>
         <w:numRestart w:val="eachSect"/>

</xml_diff>

<commit_message>
Deploying to gh-pages from @ Morrison-Lab/psw@97035c2c03e4b6a8eb9444572f0ee4367cf324b8 🚀
</commit_message>
<xml_diff>
--- a/chapters/mathematical-writing.docx
+++ b/chapters/mathematical-writing.docx
@@ -15,7 +15,7 @@
         <w:pStyle w:val="Date"/>
       </w:pPr>
       <w:r>
-        <w:t xml:space="preserve">Last modified: 2026-10-28 15:25:37 (PDT)</w:t>
+        <w:t xml:space="preserve">Last modified: 2026-10-28 15:53:04 (PDT)</w:t>
       </w:r>
     </w:p>
     <w:tbl>
@@ -1290,7 +1290,7 @@
       </w:r>
     </w:p>
     <w:bookmarkEnd w:id="27"/>
-    <w:bookmarkStart w:id="29" w:name="X635c8c263491261849c5951c600a7c8b3b0ab19"/>
+    <w:bookmarkStart w:id="30" w:name="X635c8c263491261849c5951c600a7c8b3b0ab19"/>
     <w:p>
       <w:pPr>
         <w:pStyle w:val="Heading2"/>
@@ -1342,8 +1342,356 @@
         <w:t xml:space="preserve">number a display and let you link to it.</w:t>
       </w:r>
     </w:p>
+    <w:p>
+      <w:pPr>
+        <w:pStyle w:val="BodyText"/>
+      </w:pPr>
+      <w:r>
+        <w:t xml:space="preserve">A key equation always goes in a display, never inline.</w:t>
+      </w:r>
+      <w:r>
+        <w:t xml:space="preserve"> </w:t>
+      </w:r>
+      <w:r>
+        <w:t xml:space="preserve">A key equation is any of these:</w:t>
+      </w:r>
+    </w:p>
+    <w:p>
+      <w:pPr>
+        <w:pStyle w:val="Compact"/>
+        <w:numPr>
+          <w:ilvl w:val="0"/>
+          <w:numId w:val="1001"/>
+        </w:numPr>
+      </w:pPr>
+      <w:r>
+        <w:t xml:space="preserve">the conclusion of a theorem, lemma, or proposition;</w:t>
+      </w:r>
+    </w:p>
+    <w:p>
+      <w:pPr>
+        <w:pStyle w:val="Compact"/>
+        <w:numPr>
+          <w:ilvl w:val="0"/>
+          <w:numId w:val="1001"/>
+        </w:numPr>
+      </w:pPr>
+      <w:r>
+        <w:t xml:space="preserve">an equation that a proof builds toward;</w:t>
+      </w:r>
+    </w:p>
+    <w:p>
+      <w:pPr>
+        <w:pStyle w:val="Compact"/>
+        <w:numPr>
+          <w:ilvl w:val="0"/>
+          <w:numId w:val="1001"/>
+        </w:numPr>
+      </w:pPr>
+      <w:r>
+        <w:t xml:space="preserve">an equation that a later step refers to.</w:t>
+      </w:r>
+    </w:p>
+    <w:p>
+      <w:pPr>
+        <w:pStyle w:val="FirstParagraph"/>
+      </w:pPr>
+      <w:r>
+        <w:t xml:space="preserve">In a proof, a sentence such as</w:t>
+      </w:r>
+      <w:r>
+        <w:t xml:space="preserve"> </w:t>
+      </w:r>
+      <w:r>
+        <w:t xml:space="preserve">“so</w:t>
+      </w:r>
+      <w:r>
+        <w:t xml:space="preserve"> </w:t>
+      </w:r>
+      <m:oMath>
+        <m:r>
+          <m:t>A</m:t>
+        </m:r>
+        <m:r>
+          <m:rPr>
+            <m:sty m:val="p"/>
+          </m:rPr>
+          <m:t>=</m:t>
+        </m:r>
+        <m:r>
+          <m:t>B</m:t>
+        </m:r>
+      </m:oMath>
+      <w:r>
+        <w:t xml:space="preserve">”</w:t>
+      </w:r>
+      <w:r>
+        <w:t xml:space="preserve"> </w:t>
+      </w:r>
+      <w:r>
+        <w:t xml:space="preserve">or</w:t>
+      </w:r>
+      <w:r>
+        <w:t xml:space="preserve"> </w:t>
+      </w:r>
+      <w:r>
+        <w:t xml:space="preserve">“this gives</w:t>
+      </w:r>
+      <w:r>
+        <w:t xml:space="preserve"> </w:t>
+      </w:r>
+      <m:oMath>
+        <m:r>
+          <m:t>A</m:t>
+        </m:r>
+        <m:r>
+          <m:rPr>
+            <m:sty m:val="p"/>
+          </m:rPr>
+          <m:t>=</m:t>
+        </m:r>
+        <m:r>
+          <m:t>B</m:t>
+        </m:r>
+      </m:oMath>
+      <w:r>
+        <w:t xml:space="preserve">”</w:t>
+      </w:r>
+      <w:r>
+        <w:t xml:space="preserve"> </w:t>
+      </w:r>
+      <w:r>
+        <w:t xml:space="preserve">hides the result in the middle of a line.</w:t>
+      </w:r>
+      <w:r>
+        <w:t xml:space="preserve"> </w:t>
+      </w:r>
+      <w:r>
+        <w:t xml:space="preserve">Put the equation in a display and let the sentence introduce it.</w:t>
+      </w:r>
+      <w:r>
+        <w:t xml:space="preserve"> </w:t>
+      </w:r>
+      <w:r>
+        <w:t xml:space="preserve">Use inline math for symbols and short expressions inside a sentence,</w:t>
+      </w:r>
+      <w:r>
+        <w:t xml:space="preserve"> </w:t>
+      </w:r>
+      <w:r>
+        <w:t xml:space="preserve">not for the equation the reader is meant to remember.</w:t>
+      </w:r>
+    </w:p>
+    <w:bookmarkStart w:id="29" w:name="exm-key-equation-displayed"/>
+    <w:p>
+      <w:pPr>
+        <w:pStyle w:val="BodyText"/>
+      </w:pPr>
+      <w:r>
+        <w:rPr>
+          <w:b/>
+          <w:bCs/>
+        </w:rPr>
+        <w:t xml:space="preserve">Example 5 (Displaying the normal equations)</w:t>
+      </w:r>
+      <w:r>
+        <w:t xml:space="preserve"> </w:t>
+      </w:r>
+      <w:r>
+        <w:t xml:space="preserve"> </w:t>
+      </w:r>
+    </w:p>
+    <w:p>
+      <w:pPr>
+        <w:pStyle w:val="BlockText"/>
+      </w:pPr>
+      <w:r>
+        <w:t xml:space="preserve">❌ Setting the gradient to zero yields</w:t>
+      </w:r>
+      <w:r>
+        <w:t xml:space="preserve"> </w:t>
+      </w:r>
+      <m:oMath>
+        <m:sSup>
+          <m:e>
+            <m:r>
+              <m:t>D</m:t>
+            </m:r>
+          </m:e>
+          <m:sup>
+            <m:r>
+              <m:rPr>
+                <m:sty m:val="p"/>
+              </m:rPr>
+              <m:t>⊤</m:t>
+            </m:r>
+          </m:sup>
+        </m:sSup>
+        <m:r>
+          <m:t>D</m:t>
+        </m:r>
+        <m:limLow>
+          <m:e>
+            <m:r>
+              <m:t>β</m:t>
+            </m:r>
+          </m:e>
+          <m:lim>
+            <m:r>
+              <m:rPr>
+                <m:sty m:val="p"/>
+              </m:rPr>
+              <m:t>∼</m:t>
+            </m:r>
+          </m:lim>
+        </m:limLow>
+        <m:r>
+          <m:rPr>
+            <m:sty m:val="p"/>
+          </m:rPr>
+          <m:t>=</m:t>
+        </m:r>
+        <m:sSup>
+          <m:e>
+            <m:r>
+              <m:t>D</m:t>
+            </m:r>
+          </m:e>
+          <m:sup>
+            <m:r>
+              <m:rPr>
+                <m:sty m:val="p"/>
+              </m:rPr>
+              <m:t>⊤</m:t>
+            </m:r>
+          </m:sup>
+        </m:sSup>
+        <m:limLow>
+          <m:e>
+            <m:r>
+              <m:t>y</m:t>
+            </m:r>
+          </m:e>
+          <m:lim>
+            <m:r>
+              <m:rPr>
+                <m:sty m:val="p"/>
+              </m:rPr>
+              <m:t>∼</m:t>
+            </m:r>
+          </m:lim>
+        </m:limLow>
+      </m:oMath>
+      <w:r>
+        <w:t xml:space="preserve">.</w:t>
+      </w:r>
+    </w:p>
+    <w:p>
+      <w:pPr>
+        <w:pStyle w:val="BlockText"/>
+      </w:pPr>
+      <w:r>
+        <w:t xml:space="preserve">✅ Setting the gradient to zero yields the normal equations:</w:t>
+      </w:r>
+    </w:p>
+    <w:p>
+      <w:pPr>
+        <w:pStyle w:val="BlockText"/>
+      </w:pPr>
+      <m:oMathPara>
+        <m:oMathParaPr>
+          <m:jc m:val="center"/>
+        </m:oMathParaPr>
+        <m:oMath>
+          <m:sSup>
+            <m:e>
+              <m:r>
+                <m:t>D</m:t>
+              </m:r>
+            </m:e>
+            <m:sup>
+              <m:r>
+                <m:rPr>
+                  <m:sty m:val="p"/>
+                </m:rPr>
+                <m:t>⊤</m:t>
+              </m:r>
+            </m:sup>
+          </m:sSup>
+          <m:r>
+            <m:t>D</m:t>
+          </m:r>
+          <m:limLow>
+            <m:e>
+              <m:r>
+                <m:t>β</m:t>
+              </m:r>
+            </m:e>
+            <m:lim>
+              <m:r>
+                <m:rPr>
+                  <m:sty m:val="p"/>
+                </m:rPr>
+                <m:t>∼</m:t>
+              </m:r>
+            </m:lim>
+          </m:limLow>
+          <m:r>
+            <m:rPr>
+              <m:sty m:val="p"/>
+            </m:rPr>
+            <m:t>=</m:t>
+          </m:r>
+          <m:sSup>
+            <m:e>
+              <m:r>
+                <m:t>D</m:t>
+              </m:r>
+            </m:e>
+            <m:sup>
+              <m:r>
+                <m:rPr>
+                  <m:sty m:val="p"/>
+                </m:rPr>
+                <m:t>⊤</m:t>
+              </m:r>
+            </m:sup>
+          </m:sSup>
+          <m:limLow>
+            <m:e>
+              <m:r>
+                <m:t>y</m:t>
+              </m:r>
+            </m:e>
+            <m:lim>
+              <m:r>
+                <m:rPr>
+                  <m:sty m:val="p"/>
+                </m:rPr>
+                <m:t>∼</m:t>
+              </m:r>
+            </m:lim>
+          </m:limLow>
+        </m:oMath>
+      </m:oMathPara>
+    </w:p>
+    <w:p>
+      <w:pPr>
+        <w:pStyle w:val="FirstParagraph"/>
+      </w:pPr>
+      <w:r>
+        <w:t xml:space="preserve">In the ❌ version the result sits in the middle of a line, where the reader can miss it.</w:t>
+      </w:r>
+      <w:r>
+        <w:t xml:space="preserve"> </w:t>
+      </w:r>
+      <w:r>
+        <w:t xml:space="preserve">The ✅ version gives it a line of its own.</w:t>
+      </w:r>
+    </w:p>
     <w:bookmarkEnd w:id="29"/>
-    <w:bookmarkStart w:id="30" w:name="Xa3cf6e4bc6fc8e3d4315c77eaadbd0b034cebd2"/>
+    <w:bookmarkEnd w:id="30"/>
+    <w:bookmarkStart w:id="31" w:name="Xa3cf6e4bc6fc8e3d4315c77eaadbd0b034cebd2"/>
     <w:p>
       <w:pPr>
         <w:pStyle w:val="Heading2"/>
@@ -1420,8 +1768,8 @@
         <w:t xml:space="preserve">.</w:t>
       </w:r>
     </w:p>
-    <w:bookmarkEnd w:id="30"/>
-    <w:bookmarkStart w:id="31" w:name="keep-subscripts-under-control"/>
+    <w:bookmarkEnd w:id="31"/>
+    <w:bookmarkStart w:id="32" w:name="keep-subscripts-under-control"/>
     <w:p>
       <w:pPr>
         <w:pStyle w:val="Heading2"/>
@@ -1747,8 +2095,8 @@
         <w:t xml:space="preserve">only when you need two specified elements.</w:t>
       </w:r>
     </w:p>
-    <w:bookmarkEnd w:id="31"/>
-    <w:bookmarkStart w:id="32" w:name="choose-the-voice-and-the-person"/>
+    <w:bookmarkEnd w:id="32"/>
+    <w:bookmarkStart w:id="33" w:name="choose-the-voice-and-the-person"/>
     <w:p>
       <w:pPr>
         <w:pStyle w:val="Heading2"/>
@@ -1970,8 +2318,8 @@
         <w:t xml:space="preserve">.</w:t>
       </w:r>
     </w:p>
-    <w:bookmarkEnd w:id="32"/>
-    <w:bookmarkStart w:id="33" w:name="choose-the-proof-that-fits-the-claim"/>
+    <w:bookmarkEnd w:id="33"/>
+    <w:bookmarkStart w:id="34" w:name="choose-the-proof-that-fits-the-claim"/>
     <w:p>
       <w:pPr>
         <w:pStyle w:val="Heading2"/>
@@ -2006,8 +2354,8 @@
         <w:t xml:space="preserve">and it does not assume that the entries are integers or restate their ordering.</w:t>
       </w:r>
     </w:p>
-    <w:bookmarkEnd w:id="33"/>
-    <w:bookmarkStart w:id="37" w:name="cite-results-not-solutions"/>
+    <w:bookmarkEnd w:id="34"/>
+    <w:bookmarkStart w:id="38" w:name="cite-results-not-solutions"/>
     <w:p>
       <w:pPr>
         <w:pStyle w:val="Heading2"/>
@@ -2060,7 +2408,7 @@
         <w:t xml:space="preserve">Cite that result div in every argument that uses the claim.</w:t>
       </w:r>
     </w:p>
-    <w:bookmarkStart w:id="34" w:name="exm-cite-results"/>
+    <w:bookmarkStart w:id="35" w:name="exm-cite-results"/>
     <w:p>
       <w:pPr>
         <w:pStyle w:val="BodyText"/>
@@ -2070,7 +2418,7 @@
           <w:b/>
           <w:bCs/>
         </w:rPr>
-        <w:t xml:space="preserve">Example 5 (Citing a result div)</w:t>
+        <w:t xml:space="preserve">Example 6 (Citing a result div)</w:t>
       </w:r>
       <w:r>
         <w:t xml:space="preserve"> </w:t>
@@ -2141,7 +2489,7 @@
         <w:t xml:space="preserve">The ✅ version cites claims that the notes state, number and keep.</w:t>
       </w:r>
     </w:p>
-    <w:bookmarkEnd w:id="34"/>
+    <w:bookmarkEnd w:id="35"/>
     <w:p>
       <w:pPr>
         <w:pStyle w:val="BodyText"/>
@@ -2229,7 +2577,7 @@
       <w:r>
         <w:t xml:space="preserve"> </w:t>
       </w:r>
-      <w:hyperlink r:id="rId35">
+      <w:hyperlink r:id="rId36">
         <w:r>
           <w:rPr>
             <w:rStyle w:val="Hyperlink"/>
@@ -2293,7 +2641,7 @@
       <w:r>
         <w:t xml:space="preserve"> </w:t>
       </w:r>
-      <w:hyperlink r:id="rId36">
+      <w:hyperlink r:id="rId37">
         <w:r>
           <w:rPr>
             <w:rStyle w:val="VerbatimChar"/>
@@ -2362,8 +2710,8 @@
         <w:t xml:space="preserve">The workflow does not check prose outside proof and result divs, but the rule still applies there.</w:t>
       </w:r>
     </w:p>
-    <w:bookmarkEnd w:id="37"/>
-    <w:bookmarkStart w:id="39" w:name="keep-each-div-minimal-cite-never-inline"/>
+    <w:bookmarkEnd w:id="38"/>
+    <w:bookmarkStart w:id="40" w:name="keep-each-div-minimal-cite-never-inline"/>
     <w:p>
       <w:pPr>
         <w:pStyle w:val="Heading2"/>
@@ -2398,7 +2746,7 @@
         <w:t xml:space="preserve">A solution decomposes the same way: each solution is the smallest argument that answers its exercise, and it cites result divs for the steps that other arguments also use.</w:t>
       </w:r>
     </w:p>
-    <w:bookmarkStart w:id="38" w:name="exm-never-inline"/>
+    <w:bookmarkStart w:id="39" w:name="exm-never-inline"/>
     <w:p>
       <w:pPr>
         <w:pStyle w:val="BodyText"/>
@@ -2408,7 +2756,7 @@
           <w:b/>
           <w:bCs/>
         </w:rPr>
-        <w:t xml:space="preserve">Example 6 (Citing a step instead of deriving it)</w:t>
+        <w:t xml:space="preserve">Example 7 (Citing a step instead of deriving it)</w:t>
       </w:r>
       <w:r>
         <w:t xml:space="preserve"> </w:t>
@@ -2767,7 +3115,7 @@
         <w:t xml:space="preserve">The ❌ proof derives inline the result that Lemma 4 states, so a reader who needs that step elsewhere has nowhere to cite.</w:t>
       </w:r>
     </w:p>
-    <w:bookmarkEnd w:id="38"/>
+    <w:bookmarkEnd w:id="39"/>
     <w:p>
       <w:pPr>
         <w:pStyle w:val="BodyText"/>
@@ -2811,8 +3159,8 @@
         <w:t xml:space="preserve">workflow covers only the citation of solutions.</w:t>
       </w:r>
     </w:p>
-    <w:bookmarkEnd w:id="39"/>
-    <w:bookmarkStart w:id="51" w:name="rules-that-other-chapters-cover"/>
+    <w:bookmarkEnd w:id="40"/>
+    <w:bookmarkStart w:id="52" w:name="rules-that-other-chapters-cover"/>
     <w:p>
       <w:pPr>
         <w:pStyle w:val="Heading2"/>
@@ -2853,7 +3201,7 @@
       <w:tr>
         <w:tc>
           <w:tcPr/>
-          <w:bookmarkStart w:id="47" w:name="tbl-knuth-elsewhere"/>
+          <w:bookmarkStart w:id="48" w:name="tbl-knuth-elsewhere"/>
           <w:p>
             <w:pPr>
               <w:jc w:val="center"/>
@@ -2989,7 +3337,7 @@
                     <w:pStyle w:val="Compact"/>
                     <w:jc w:val="center"/>
                   </w:pPr>
-                  <w:hyperlink r:id="rId40">
+                  <w:hyperlink r:id="rId41">
                     <w:r>
                       <w:rPr>
                         <w:rStyle w:val="Hyperlink"/>
@@ -3020,7 +3368,7 @@
                     <w:pStyle w:val="Compact"/>
                     <w:jc w:val="center"/>
                   </w:pPr>
-                  <w:hyperlink r:id="rId41">
+                  <w:hyperlink r:id="rId42">
                     <w:r>
                       <w:rPr>
                         <w:rStyle w:val="Hyperlink"/>
@@ -3051,7 +3399,7 @@
                     <w:pStyle w:val="Compact"/>
                     <w:jc w:val="center"/>
                   </w:pPr>
-                  <w:hyperlink r:id="rId42">
+                  <w:hyperlink r:id="rId43">
                     <w:r>
                       <w:rPr>
                         <w:rStyle w:val="Hyperlink"/>
@@ -3082,7 +3430,7 @@
                     <w:pStyle w:val="Compact"/>
                     <w:jc w:val="center"/>
                   </w:pPr>
-                  <w:hyperlink r:id="rId43">
+                  <w:hyperlink r:id="rId44">
                     <w:r>
                       <w:rPr>
                         <w:rStyle w:val="Hyperlink"/>
@@ -3131,7 +3479,7 @@
                   <w:r>
                     <w:t xml:space="preserve"> </w:t>
                   </w:r>
-                  <w:hyperlink r:id="rId44">
+                  <w:hyperlink r:id="rId45">
                     <w:r>
                       <w:rPr>
                         <w:rStyle w:val="Hyperlink"/>
@@ -3148,7 +3496,7 @@
                     <w:pStyle w:val="Compact"/>
                     <w:jc w:val="center"/>
                   </w:pPr>
-                  <w:hyperlink r:id="rId45">
+                  <w:hyperlink r:id="rId46">
                     <w:r>
                       <w:rPr>
                         <w:rStyle w:val="Hyperlink"/>
@@ -3179,7 +3527,7 @@
                     <w:pStyle w:val="Compact"/>
                     <w:jc w:val="center"/>
                   </w:pPr>
-                  <w:hyperlink r:id="rId46">
+                  <w:hyperlink r:id="rId47">
                     <w:r>
                       <w:rPr>
                         <w:rStyle w:val="Hyperlink"/>
@@ -3191,13 +3539,13 @@
               </w:tc>
             </w:tr>
           </w:tbl>
-          <w:bookmarkEnd w:id="47"/>
+          <w:bookmarkEnd w:id="48"/>
           <w:p/>
         </w:tc>
       </w:tr>
     </w:tbl>
-    <w:bookmarkStart w:id="50" w:name="refs"/>
-    <w:bookmarkStart w:id="49" w:name="ref-knuth1987mathematical"/>
+    <w:bookmarkStart w:id="51" w:name="refs"/>
+    <w:bookmarkStart w:id="50" w:name="ref-knuth1987mathematical"/>
     <w:p>
       <w:pPr>
         <w:pStyle w:val="Bibliography"/>
@@ -3221,7 +3569,7 @@
       <w:r>
         <w:t xml:space="preserve"> </w:t>
       </w:r>
-      <w:hyperlink r:id="rId48">
+      <w:hyperlink r:id="rId49">
         <w:r>
           <w:rPr>
             <w:rStyle w:val="Hyperlink"/>
@@ -3233,9 +3581,9 @@
         <w:t xml:space="preserve">.</w:t>
       </w:r>
     </w:p>
-    <w:bookmarkEnd w:id="49"/>
     <w:bookmarkEnd w:id="50"/>
     <w:bookmarkEnd w:id="51"/>
+    <w:bookmarkEnd w:id="52"/>
     <w:sectPr>
       <w:footnotePr>
         <w:numRestart w:val="eachSect"/>
@@ -3346,8 +3694,114 @@
       </w:pPr>
     </w:lvl>
   </w:abstractNum>
+  <w:abstractNum w:abstractNumId="991">
+    <w:nsid w:val="0000A991"/>
+    <w:multiLevelType w:val="multilevel"/>
+    <w:lvl w:ilvl="0">
+      <w:numFmt w:val="bullet"/>
+      <w:lvlText w:val=""/>
+      <w:lvlJc w:val="left"/>
+      <w:pPr>
+        <w:ind w:left="720" w:hanging="360"/>
+      </w:pPr>
+      <w:rPr>
+        <w:rFonts w:ascii="Symbol" w:hAnsi="Symbol" w:cs="Symbol" w:hint="default"/>
+      </w:rPr>
+    </w:lvl>
+    <w:lvl w:ilvl="1">
+      <w:numFmt w:val="bullet"/>
+      <w:lvlText w:val="o"/>
+      <w:lvlJc w:val="left"/>
+      <w:pPr>
+        <w:ind w:left="1440" w:hanging="360"/>
+      </w:pPr>
+      <w:rPr>
+        <w:rFonts w:ascii="Courier New" w:hAnsi="Courier New" w:cs="Courier New" w:hint="default"/>
+      </w:rPr>
+    </w:lvl>
+    <w:lvl w:ilvl="2">
+      <w:numFmt w:val="bullet"/>
+      <w:lvlText w:val=""/>
+      <w:lvlJc w:val="left"/>
+      <w:pPr>
+        <w:ind w:left="2160" w:hanging="360"/>
+      </w:pPr>
+      <w:rPr>
+        <w:rFonts w:ascii="Wingdings" w:hAnsi="Wingdings" w:cs="Wingdings" w:hint="default"/>
+      </w:rPr>
+    </w:lvl>
+    <w:lvl w:ilvl="3">
+      <w:numFmt w:val="bullet"/>
+      <w:lvlText w:val=""/>
+      <w:lvlJc w:val="left"/>
+      <w:pPr>
+        <w:ind w:left="2880" w:hanging="360"/>
+      </w:pPr>
+      <w:rPr>
+        <w:rFonts w:ascii="Symbol" w:hAnsi="Symbol" w:cs="Symbol" w:hint="default"/>
+      </w:rPr>
+    </w:lvl>
+    <w:lvl w:ilvl="4">
+      <w:numFmt w:val="bullet"/>
+      <w:lvlText w:val="o"/>
+      <w:lvlJc w:val="left"/>
+      <w:pPr>
+        <w:ind w:left="3600" w:hanging="360"/>
+      </w:pPr>
+      <w:rPr>
+        <w:rFonts w:ascii="Courier New" w:hAnsi="Courier New" w:cs="Courier New" w:hint="default"/>
+      </w:rPr>
+    </w:lvl>
+    <w:lvl w:ilvl="5">
+      <w:numFmt w:val="bullet"/>
+      <w:lvlText w:val=""/>
+      <w:lvlJc w:val="left"/>
+      <w:pPr>
+        <w:ind w:left="4320" w:hanging="360"/>
+      </w:pPr>
+      <w:rPr>
+        <w:rFonts w:ascii="Wingdings" w:hAnsi="Wingdings" w:cs="Wingdings" w:hint="default"/>
+      </w:rPr>
+    </w:lvl>
+    <w:lvl w:ilvl="6">
+      <w:numFmt w:val="bullet"/>
+      <w:lvlText w:val=""/>
+      <w:lvlJc w:val="left"/>
+      <w:pPr>
+        <w:ind w:left="5040" w:hanging="360"/>
+      </w:pPr>
+      <w:rPr>
+        <w:rFonts w:ascii="Symbol" w:hAnsi="Symbol" w:cs="Symbol" w:hint="default"/>
+      </w:rPr>
+    </w:lvl>
+    <w:lvl w:ilvl="7">
+      <w:numFmt w:val="bullet"/>
+      <w:lvlText w:val="o"/>
+      <w:lvlJc w:val="left"/>
+      <w:pPr>
+        <w:ind w:left="5760" w:hanging="360"/>
+      </w:pPr>
+      <w:rPr>
+        <w:rFonts w:ascii="Courier New" w:hAnsi="Courier New" w:cs="Courier New" w:hint="default"/>
+      </w:rPr>
+    </w:lvl>
+    <w:lvl w:ilvl="8">
+      <w:numFmt w:val="bullet"/>
+      <w:lvlText w:val=""/>
+      <w:lvlJc w:val="left"/>
+      <w:pPr>
+        <w:ind w:left="6480" w:hanging="360"/>
+      </w:pPr>
+      <w:rPr>
+        <w:rFonts w:ascii="Wingdings" w:hAnsi="Wingdings" w:cs="Wingdings" w:hint="default"/>
+      </w:rPr>
+    </w:lvl>
+  </w:abstractNum>
   <w:num w:numId="1000">
     <w:abstractNumId w:val="990"/>
+  </w:num>
+  <w:num w:numId="1001">
+    <w:abstractNumId w:val="991"/>
   </w:num>
 </w:numbering>
 </file>

</xml_diff>

<commit_message>
Deploying to gh-pages from @ Morrison-Lab/psw@aee208e40ef25fd22f8db1a7f65fa6d1f8fb9e73 🚀
</commit_message>
<xml_diff>
--- a/chapters/mathematical-writing.docx
+++ b/chapters/mathematical-writing.docx
@@ -15,7 +15,7 @@
         <w:pStyle w:val="Date"/>
       </w:pPr>
       <w:r>
-        <w:t xml:space="preserve">Last modified: 2026-10-29 16:45:39 (PDT)</w:t>
+        <w:t xml:space="preserve">Last modified: 2026-10-29 16:56:32 (PDT)</w:t>
       </w:r>
     </w:p>
     <w:tbl>
@@ -3631,13 +3631,679 @@
       </w:r>
     </w:p>
     <w:bookmarkEnd w:id="42"/>
-    <w:bookmarkStart w:id="54" w:name="rules-that-other-chapters-cover"/>
+    <w:bookmarkStart w:id="48" w:name="Xd2b1f08161d44443d3d9c5e89d9ddf68e118cc1"/>
     <w:p>
       <w:pPr>
         <w:pStyle w:val="Heading2"/>
       </w:pPr>
       <w:r>
-        <w:t xml:space="preserve">10 Rules that other chapters cover</w:t>
+        <w:t xml:space="preserve">10 Use no symbol that the statement does not need</w:t>
+      </w:r>
+    </w:p>
+    <w:p>
+      <w:pPr>
+        <w:pStyle w:val="FirstParagraph"/>
+      </w:pPr>
+      <w:r>
+        <w:t xml:space="preserve">Halmos advises</w:t>
+      </w:r>
+      <w:r>
+        <w:t xml:space="preserve"> </w:t>
+      </w:r>
+      <w:r>
+        <w:t xml:space="preserve">“avoid the use of irrelevant symbols”</w:t>
+      </w:r>
+      <w:r>
+        <w:t xml:space="preserve"> </w:t>
+      </w:r>
+      <w:r>
+        <w:t xml:space="preserve">and states the rule in its showy form as</w:t>
+      </w:r>
+      <w:r>
+        <w:t xml:space="preserve"> </w:t>
+      </w:r>
+      <w:r>
+        <w:t xml:space="preserve">“use no letter only once”</w:t>
+      </w:r>
+      <w:r>
+        <w:t xml:space="preserve"> </w:t>
+      </w:r>
+      <w:r>
+        <w:t xml:space="preserve">(Halmos 1970, sec. 15)</w:t>
+      </w:r>
+      <w:r>
+        <w:t xml:space="preserve">.</w:t>
+      </w:r>
+      <w:r>
+        <w:t xml:space="preserve"> </w:t>
+      </w:r>
+      <w:r>
+        <w:t xml:space="preserve">A symbol that appears once, in the sentence that introduces it,</w:t>
+      </w:r>
+      <w:r>
+        <w:t xml:space="preserve"> </w:t>
+      </w:r>
+      <w:r>
+        <w:t xml:space="preserve">adds a name for the reader to hold and nothing to use it for.</w:t>
+      </w:r>
+      <w:r>
+        <w:t xml:space="preserve"> </w:t>
+      </w:r>
+      <w:r>
+        <w:t xml:space="preserve">Delete the symbol, or use it in the statement that needs it.</w:t>
+      </w:r>
+    </w:p>
+    <w:bookmarkStart w:id="44" w:name="exm-superfluous-symbol"/>
+    <w:p>
+      <w:pPr>
+        <w:pStyle w:val="BodyText"/>
+      </w:pPr>
+      <w:r>
+        <w:rPr>
+          <w:b/>
+          <w:bCs/>
+        </w:rPr>
+        <w:t xml:space="preserve">Example 9 (Deleting a symbol that is named and never used)</w:t>
+      </w:r>
+      <w:r>
+        <w:t xml:space="preserve"> </w:t>
+      </w:r>
+      <w:r>
+        <w:t xml:space="preserve"> </w:t>
+      </w:r>
+    </w:p>
+    <w:p>
+      <w:pPr>
+        <w:pStyle w:val="BlockText"/>
+      </w:pPr>
+      <w:r>
+        <w:t xml:space="preserve">❌ Every continuous real-valued</w:t>
+      </w:r>
+      <w:r>
+        <w:t xml:space="preserve"> </w:t>
+      </w:r>
+      <w:hyperlink r:id="rId43">
+        <w:r>
+          <w:rPr>
+            <w:rStyle w:val="Hyperlink"/>
+          </w:rPr>
+          <w:t xml:space="preserve">function</w:t>
+        </w:r>
+      </w:hyperlink>
+      <w:r>
+        <w:t xml:space="preserve"> </w:t>
+      </w:r>
+      <m:oMath>
+        <m:r>
+          <m:t>f</m:t>
+        </m:r>
+      </m:oMath>
+      <w:r>
+        <w:t xml:space="preserve"> </w:t>
+      </w:r>
+      <w:r>
+        <w:t xml:space="preserve">on a compact space is bounded.</w:t>
+      </w:r>
+    </w:p>
+    <w:p>
+      <w:pPr>
+        <w:pStyle w:val="BlockText"/>
+      </w:pPr>
+      <w:r>
+        <w:t xml:space="preserve">✅ Every continuous real-valued function on a compact space is bounded.</w:t>
+      </w:r>
+    </w:p>
+    <w:p>
+      <w:pPr>
+        <w:pStyle w:val="FirstParagraph"/>
+      </w:pPr>
+      <w:r>
+        <w:t xml:space="preserve">Nothing in the sentence refers to</w:t>
+      </w:r>
+      <w:r>
+        <w:t xml:space="preserve"> </w:t>
+      </w:r>
+      <m:oMath>
+        <m:r>
+          <m:t>f</m:t>
+        </m:r>
+      </m:oMath>
+      <w:r>
+        <w:t xml:space="preserve"> </w:t>
+      </w:r>
+      <w:r>
+        <w:t xml:space="preserve">again,</w:t>
+      </w:r>
+      <w:r>
+        <w:t xml:space="preserve"> </w:t>
+      </w:r>
+      <w:r>
+        <w:t xml:space="preserve">so the symbol contributes nothing to the statement.</w:t>
+      </w:r>
+      <w:r>
+        <w:t xml:space="preserve"> </w:t>
+      </w:r>
+      <w:r>
+        <w:t xml:space="preserve">Halmos gives this sentence as his example</w:t>
+      </w:r>
+      <w:r>
+        <w:t xml:space="preserve"> </w:t>
+      </w:r>
+      <w:r>
+        <w:t xml:space="preserve">(Halmos 1970, sec. 15)</w:t>
+      </w:r>
+      <w:r>
+        <w:t xml:space="preserve">.</w:t>
+      </w:r>
+    </w:p>
+    <w:bookmarkEnd w:id="44"/>
+    <w:p>
+      <w:pPr>
+        <w:pStyle w:val="BodyText"/>
+      </w:pPr>
+      <w:r>
+        <w:t xml:space="preserve">When you apply a displayed relation to a second object, name the relation or restate it, rather than citing its tag.</w:t>
+      </w:r>
+      <w:r>
+        <w:t xml:space="preserve"> </w:t>
+      </w:r>
+      <w:r>
+        <w:t xml:space="preserve">Halmos calls</w:t>
+      </w:r>
+      <w:r>
+        <w:t xml:space="preserve"> </w:t>
+      </w:r>
+      <w:r>
+        <w:t xml:space="preserve">“</w:t>
+      </w:r>
+      <m:oMath>
+        <m:r>
+          <m:t>g</m:t>
+        </m:r>
+      </m:oMath>
+      <w:r>
+        <w:t xml:space="preserve"> </w:t>
+      </w:r>
+      <w:r>
+        <w:t xml:space="preserve">also satisfies (</w:t>
+      </w:r>
+      <w:r>
+        <w:rPr>
+          <w:i/>
+          <w:iCs/>
+        </w:rPr>
+        <w:t xml:space="preserve">)” ”logical and alphabetical nonsense”</w:t>
+      </w:r>
+      <w:r>
+        <w:rPr>
+          <w:i/>
+          <w:iCs/>
+        </w:rPr>
+        <w:t xml:space="preserve"> </w:t>
+      </w:r>
+      <w:r>
+        <w:rPr>
+          <w:i/>
+          <w:iCs/>
+        </w:rPr>
+        <w:t xml:space="preserve">and advises ”(</w:t>
+      </w:r>
+      <w:r>
+        <w:t xml:space="preserve">) remains satisfied if</w:t>
+      </w:r>
+      <w:r>
+        <w:t xml:space="preserve"> </w:t>
+      </w:r>
+      <m:oMath>
+        <m:r>
+          <m:t>f</m:t>
+        </m:r>
+      </m:oMath>
+      <w:r>
+        <w:t xml:space="preserve"> </w:t>
+      </w:r>
+      <w:r>
+        <w:t xml:space="preserve">is replaced by</w:t>
+      </w:r>
+      <w:r>
+        <w:t xml:space="preserve"> </w:t>
+      </w:r>
+      <m:oMath>
+        <m:r>
+          <m:t>g</m:t>
+        </m:r>
+      </m:oMath>
+      <w:r>
+        <w:t xml:space="preserve">”</w:t>
+      </w:r>
+      <w:r>
+        <w:t xml:space="preserve">,</w:t>
+      </w:r>
+      <w:r>
+        <w:t xml:space="preserve"> </w:t>
+      </w:r>
+      <w:r>
+        <w:t xml:space="preserve">or, better, giving the relation a name</w:t>
+      </w:r>
+      <w:r>
+        <w:t xml:space="preserve"> </w:t>
+      </w:r>
+      <w:r>
+        <w:t xml:space="preserve">(Halmos 1970, sec. 15)</w:t>
+      </w:r>
+      <w:r>
+        <w:t xml:space="preserve">.</w:t>
+      </w:r>
+      <w:r>
+        <w:t xml:space="preserve"> </w:t>
+      </w:r>
+      <w:r>
+        <w:t xml:space="preserve">A named relation also lets the reader find it without hunting for a tag.</w:t>
+      </w:r>
+    </w:p>
+    <w:bookmarkStart w:id="47" w:name="exm-name-the-relation"/>
+    <w:p>
+      <w:pPr>
+        <w:pStyle w:val="BodyText"/>
+      </w:pPr>
+      <w:r>
+        <w:rPr>
+          <w:b/>
+          <w:bCs/>
+        </w:rPr>
+        <w:t xml:space="preserve">Example 10 (Naming the relation instead of tagging it)</w:t>
+      </w:r>
+      <w:r>
+        <w:t xml:space="preserve"> </w:t>
+      </w:r>
+      <w:r>
+        <w:t xml:space="preserve"> </w:t>
+      </w:r>
+    </w:p>
+    <w:p>
+      <w:pPr>
+        <w:pStyle w:val="BlockText"/>
+      </w:pPr>
+      <w:r>
+        <w:t xml:space="preserve">❌ The</w:t>
+      </w:r>
+      <w:r>
+        <w:t xml:space="preserve"> </w:t>
+      </w:r>
+      <w:hyperlink r:id="rId45">
+        <w:r>
+          <w:rPr>
+            <w:rStyle w:val="Hyperlink"/>
+          </w:rPr>
+          <w:t xml:space="preserve">sample mean</w:t>
+        </w:r>
+      </w:hyperlink>
+      <w:r>
+        <w:t xml:space="preserve"> </w:t>
+      </w:r>
+      <w:r>
+        <w:t xml:space="preserve">satisfies Equation 3, which says that the estimator’s expected value equals the parameter.</w:t>
+      </w:r>
+      <w:r>
+        <w:t xml:space="preserve"> </w:t>
+      </w:r>
+      <w:r>
+        <w:t xml:space="preserve">The sample</w:t>
+      </w:r>
+      <w:r>
+        <w:t xml:space="preserve"> </w:t>
+      </w:r>
+      <w:hyperlink r:id="rId46">
+        <w:r>
+          <w:rPr>
+            <w:rStyle w:val="Hyperlink"/>
+          </w:rPr>
+          <w:t xml:space="preserve">variance</w:t>
+        </w:r>
+      </w:hyperlink>
+      <w:r>
+        <w:t xml:space="preserve"> </w:t>
+      </w:r>
+      <w:r>
+        <w:t xml:space="preserve">also satisfies Equation 3.</w:t>
+      </w:r>
+    </w:p>
+    <w:p>
+      <w:pPr>
+        <w:pStyle w:val="BlockText"/>
+      </w:pPr>
+      <w:r>
+        <w:t xml:space="preserve">✅ The sample mean is an unbiased estimator of the</w:t>
+      </w:r>
+      <w:r>
+        <w:t xml:space="preserve"> </w:t>
+      </w:r>
+      <w:hyperlink r:id="rId20">
+        <w:r>
+          <w:rPr>
+            <w:rStyle w:val="Hyperlink"/>
+          </w:rPr>
+          <w:t xml:space="preserve">population</w:t>
+        </w:r>
+      </w:hyperlink>
+      <w:r>
+        <w:t xml:space="preserve"> </w:t>
+      </w:r>
+      <w:r>
+        <w:t xml:space="preserve">mean.</w:t>
+      </w:r>
+      <w:r>
+        <w:t xml:space="preserve"> </w:t>
+      </w:r>
+      <w:r>
+        <w:t xml:space="preserve">The sample variance is an unbiased estimator of the population variance.</w:t>
+      </w:r>
+    </w:p>
+    <w:p>
+      <w:pPr>
+        <w:pStyle w:val="FirstParagraph"/>
+      </w:pPr>
+      <w:r>
+        <w:t xml:space="preserve">In the ❌ version,</w:t>
+      </w:r>
+      <w:r>
+        <w:t xml:space="preserve"> </w:t>
+      </w:r>
+      <w:r>
+        <w:t xml:space="preserve">“also satisfies Equation 3”</w:t>
+      </w:r>
+      <w:r>
+        <w:t xml:space="preserve"> </w:t>
+      </w:r>
+      <w:r>
+        <w:t xml:space="preserve">is a statement about a different parameter,</w:t>
+      </w:r>
+      <w:r>
+        <w:t xml:space="preserve"> </w:t>
+      </w:r>
+      <w:r>
+        <w:t xml:space="preserve">and the equation says nothing about which parameter.</w:t>
+      </w:r>
+      <w:r>
+        <w:t xml:space="preserve"> </w:t>
+      </w:r>
+      <w:r>
+        <w:t xml:space="preserve">The ✅ version names the property,</w:t>
+      </w:r>
+      <w:r>
+        <w:t xml:space="preserve"> </w:t>
+      </w:r>
+      <w:r>
+        <w:t xml:space="preserve">“unbiased”</w:t>
+      </w:r>
+      <w:r>
+        <w:t xml:space="preserve">,</w:t>
+      </w:r>
+      <w:r>
+        <w:t xml:space="preserve"> </w:t>
+      </w:r>
+      <w:r>
+        <w:t xml:space="preserve">and states each parameter.</w:t>
+      </w:r>
+    </w:p>
+    <w:bookmarkEnd w:id="47"/>
+    <w:p>
+      <w:pPr>
+        <w:pStyle w:val="BodyText"/>
+      </w:pPr>
+      <w:r>
+        <w:t xml:space="preserve">Halmos also says this rule</w:t>
+      </w:r>
+      <w:r>
+        <w:t xml:space="preserve"> </w:t>
+      </w:r>
+      <w:r>
+        <w:t xml:space="preserve">“is sometimes better to break than to obey”</w:t>
+      </w:r>
+      <w:r>
+        <w:t xml:space="preserve">:</w:t>
+      </w:r>
+      <w:r>
+        <w:t xml:space="preserve"> </w:t>
+      </w:r>
+      <w:r>
+        <w:t xml:space="preserve">a symbol that you introduce so that a later sentence in the same paragraph can use it is not superfluous.</w:t>
+      </w:r>
+      <w:r>
+        <w:t xml:space="preserve"> </w:t>
+      </w:r>
+      <w:r>
+        <w:t xml:space="preserve">No check can tell a symbol that a later sentence uses from one that it never uses,</w:t>
+      </w:r>
+      <w:r>
+        <w:t xml:space="preserve"> </w:t>
+      </w:r>
+      <w:r>
+        <w:t xml:space="preserve">because</w:t>
+      </w:r>
+      <w:r>
+        <w:t xml:space="preserve"> </w:t>
+      </w:r>
+      <w:r>
+        <w:t xml:space="preserve">“later”</w:t>
+      </w:r>
+      <w:r>
+        <w:t xml:space="preserve"> </w:t>
+      </w:r>
+      <w:r>
+        <w:t xml:space="preserve">can span pages, so this stays a writing rule that review enforces.</w:t>
+      </w:r>
+    </w:p>
+    <w:bookmarkEnd w:id="48"/>
+    <w:bookmarkStart w:id="52" w:name="Xd4c420c794a4d3e47a75832ce6d850be7dcc245"/>
+    <w:p>
+      <w:pPr>
+        <w:pStyle w:val="Heading2"/>
+      </w:pPr>
+      <w:r>
+        <w:t xml:space="preserve">11 Repeat the wording of parallel results, then point out the difference</w:t>
+      </w:r>
+    </w:p>
+    <w:p>
+      <w:pPr>
+        <w:pStyle w:val="FirstParagraph"/>
+      </w:pPr>
+      <w:r>
+        <w:t xml:space="preserve">When a later result treats a parallel or more general case,</w:t>
+      </w:r>
+      <w:r>
+        <w:t xml:space="preserve"> </w:t>
+      </w:r>
+      <w:r>
+        <w:t xml:space="preserve">Halmos advises that</w:t>
+      </w:r>
+      <w:r>
+        <w:t xml:space="preserve"> </w:t>
+      </w:r>
+      <w:r>
+        <w:t xml:space="preserve">“it is a big help to the reader</w:t>
+      </w:r>
+      <w:r>
+        <w:t xml:space="preserve"> </w:t>
+      </w:r>
+      <w:r>
+        <w:t xml:space="preserve">if you use the same words in the same order for as long as possible,</w:t>
+      </w:r>
+      <w:r>
+        <w:t xml:space="preserve"> </w:t>
+      </w:r>
+      <w:r>
+        <w:t xml:space="preserve">and then, with a proper roll of drums, emphasize the difference”</w:t>
+      </w:r>
+      <w:r>
+        <w:t xml:space="preserve"> </w:t>
+      </w:r>
+      <w:r>
+        <w:t xml:space="preserve">(Halmos 1970, sec. 11)</w:t>
+      </w:r>
+      <w:r>
+        <w:t xml:space="preserve">.</w:t>
+      </w:r>
+      <w:r>
+        <w:t xml:space="preserve"> </w:t>
+      </w:r>
+      <w:r>
+        <w:t xml:space="preserve">He adds that listing the shared conditions and dropping one is not enough;</w:t>
+      </w:r>
+      <w:r>
+        <w:t xml:space="preserve"> </w:t>
+      </w:r>
+      <w:r>
+        <w:t xml:space="preserve">say which condition changed</w:t>
+      </w:r>
+      <w:r>
+        <w:t xml:space="preserve"> </w:t>
+      </w:r>
+      <w:r>
+        <w:t xml:space="preserve">(Halmos 1970, sec. 11)</w:t>
+      </w:r>
+      <w:r>
+        <w:t xml:space="preserve">.</w:t>
+      </w:r>
+    </w:p>
+    <w:bookmarkStart w:id="50" w:name="exm-parallel-wording"/>
+    <w:p>
+      <w:pPr>
+        <w:pStyle w:val="BodyText"/>
+      </w:pPr>
+      <w:r>
+        <w:rPr>
+          <w:b/>
+          <w:bCs/>
+        </w:rPr>
+        <w:t xml:space="preserve">Example 11 (Defining the lasso in the words of the ridge definition)</w:t>
+      </w:r>
+      <w:r>
+        <w:t xml:space="preserve"> </w:t>
+      </w:r>
+      <w:r>
+        <w:t xml:space="preserve"> </w:t>
+      </w:r>
+    </w:p>
+    <w:p>
+      <w:pPr>
+        <w:pStyle w:val="BlockText"/>
+      </w:pPr>
+      <w:r>
+        <w:t xml:space="preserve">❌ The ridge estimate minimizes the</w:t>
+      </w:r>
+      <w:r>
+        <w:t xml:space="preserve"> </w:t>
+      </w:r>
+      <w:hyperlink r:id="rId49">
+        <w:r>
+          <w:rPr>
+            <w:rStyle w:val="Hyperlink"/>
+          </w:rPr>
+          <w:t xml:space="preserve">residual sum of squares</w:t>
+        </w:r>
+      </w:hyperlink>
+      <w:r>
+        <w:t xml:space="preserve"> </w:t>
+      </w:r>
+      <w:r>
+        <w:t xml:space="preserve">plus a penalty on the size of the coefficients, which is the sum of their squares.</w:t>
+      </w:r>
+      <w:r>
+        <w:t xml:space="preserve"> </w:t>
+      </w:r>
+      <w:r>
+        <w:t xml:space="preserve">The lasso estimate is the vector of coefficients with the smallest penalized fit, where the penalty adds up the absolute values.</w:t>
+      </w:r>
+    </w:p>
+    <w:p>
+      <w:pPr>
+        <w:pStyle w:val="BlockText"/>
+      </w:pPr>
+      <w:r>
+        <w:t xml:space="preserve">✅ The ridge estimate minimizes the residual sum of squares plus a penalty equal to the sum of the squared coefficients.</w:t>
+      </w:r>
+      <w:r>
+        <w:t xml:space="preserve"> </w:t>
+      </w:r>
+      <w:r>
+        <w:t xml:space="preserve">The lasso estimate minimizes the residual sum of squares plus a penalty equal to the sum of the absolute values of the coefficients.</w:t>
+      </w:r>
+      <w:r>
+        <w:t xml:space="preserve"> </w:t>
+      </w:r>
+      <w:r>
+        <w:t xml:space="preserve">The two definitions differ only in the penalty.</w:t>
+      </w:r>
+    </w:p>
+    <w:p>
+      <w:pPr>
+        <w:pStyle w:val="FirstParagraph"/>
+      </w:pPr>
+      <w:r>
+        <w:t xml:space="preserve">The ❌ pair varies every phrase, so the reader must compare them clause by clause to find that only the penalty differs.</w:t>
+      </w:r>
+      <w:r>
+        <w:t xml:space="preserve"> </w:t>
+      </w:r>
+      <w:r>
+        <w:t xml:space="preserve">The ✅ pair repeats the shared words and ends by naming the one change.</w:t>
+      </w:r>
+    </w:p>
+    <w:bookmarkEnd w:id="50"/>
+    <w:p>
+      <w:pPr>
+        <w:pStyle w:val="BodyText"/>
+      </w:pPr>
+      <w:r>
+        <w:t xml:space="preserve">Rewording is for the places where the meaning differs.</w:t>
+      </w:r>
+      <w:r>
+        <w:t xml:space="preserve"> </w:t>
+      </w:r>
+      <w:r>
+        <w:t xml:space="preserve">Do not repeat a result for the sake of repetition;</w:t>
+      </w:r>
+      <w:r>
+        <w:t xml:space="preserve"> </w:t>
+      </w:r>
+      <w:hyperlink r:id="rId51">
+        <w:r>
+          <w:rPr>
+            <w:rStyle w:val="Hyperlink"/>
+          </w:rPr>
+          <w:t xml:space="preserve">reuse one written version of each result</w:t>
+        </w:r>
+      </w:hyperlink>
+      <w:r>
+        <w:t xml:space="preserve"> </w:t>
+      </w:r>
+      <w:r>
+        <w:t xml:space="preserve">covers that case.</w:t>
+      </w:r>
+    </w:p>
+    <w:p>
+      <w:pPr>
+        <w:pStyle w:val="BodyText"/>
+      </w:pPr>
+      <w:r>
+        <w:t xml:space="preserve">No check can decide that two results are parallel,</w:t>
+      </w:r>
+      <w:r>
+        <w:t xml:space="preserve"> </w:t>
+      </w:r>
+      <w:r>
+        <w:t xml:space="preserve">so this stays a writing rule that review enforces.</w:t>
+      </w:r>
+    </w:p>
+    <w:bookmarkEnd w:id="52"/>
+    <w:bookmarkStart w:id="66" w:name="rules-that-other-chapters-cover"/>
+    <w:p>
+      <w:pPr>
+        <w:pStyle w:val="Heading2"/>
+      </w:pPr>
+      <w:r>
+        <w:t xml:space="preserve">12 Rules that other chapters cover</w:t>
       </w:r>
     </w:p>
     <w:p>
@@ -3672,7 +4338,7 @@
       <w:tr>
         <w:tc>
           <w:tcPr/>
-          <w:bookmarkStart w:id="50" w:name="tbl-knuth-elsewhere"/>
+          <w:bookmarkStart w:id="60" w:name="tbl-knuth-elsewhere"/>
           <w:p>
             <w:pPr>
               <w:jc w:val="center"/>
@@ -3808,7 +4474,7 @@
                     <w:pStyle w:val="Compact"/>
                     <w:jc w:val="center"/>
                   </w:pPr>
-                  <w:hyperlink r:id="rId43">
+                  <w:hyperlink r:id="rId53">
                     <w:r>
                       <w:rPr>
                         <w:rStyle w:val="Hyperlink"/>
@@ -3839,7 +4505,7 @@
                     <w:pStyle w:val="Compact"/>
                     <w:jc w:val="center"/>
                   </w:pPr>
-                  <w:hyperlink r:id="rId44">
+                  <w:hyperlink r:id="rId54">
                     <w:r>
                       <w:rPr>
                         <w:rStyle w:val="Hyperlink"/>
@@ -3870,7 +4536,7 @@
                     <w:pStyle w:val="Compact"/>
                     <w:jc w:val="center"/>
                   </w:pPr>
-                  <w:hyperlink r:id="rId45">
+                  <w:hyperlink r:id="rId55">
                     <w:r>
                       <w:rPr>
                         <w:rStyle w:val="Hyperlink"/>
@@ -3901,7 +4567,7 @@
                     <w:pStyle w:val="Compact"/>
                     <w:jc w:val="center"/>
                   </w:pPr>
-                  <w:hyperlink r:id="rId46">
+                  <w:hyperlink r:id="rId56">
                     <w:r>
                       <w:rPr>
                         <w:rStyle w:val="Hyperlink"/>
@@ -3950,7 +4616,7 @@
                   <w:r>
                     <w:t xml:space="preserve"> </w:t>
                   </w:r>
-                  <w:hyperlink r:id="rId47">
+                  <w:hyperlink r:id="rId57">
                     <w:r>
                       <w:rPr>
                         <w:rStyle w:val="Hyperlink"/>
@@ -3967,7 +4633,7 @@
                     <w:pStyle w:val="Compact"/>
                     <w:jc w:val="center"/>
                   </w:pPr>
-                  <w:hyperlink r:id="rId48">
+                  <w:hyperlink r:id="rId58">
                     <w:r>
                       <w:rPr>
                         <w:rStyle w:val="Hyperlink"/>
@@ -3998,7 +4664,7 @@
                     <w:pStyle w:val="Compact"/>
                     <w:jc w:val="center"/>
                   </w:pPr>
-                  <w:hyperlink r:id="rId49">
+                  <w:hyperlink r:id="rId59">
                     <w:r>
                       <w:rPr>
                         <w:rStyle w:val="Hyperlink"/>
@@ -4010,13 +4676,73 @@
               </w:tc>
             </w:tr>
           </w:tbl>
-          <w:bookmarkEnd w:id="50"/>
+          <w:bookmarkEnd w:id="60"/>
           <w:p/>
         </w:tc>
       </w:tr>
     </w:tbl>
-    <w:bookmarkStart w:id="53" w:name="refs"/>
-    <w:bookmarkStart w:id="52" w:name="ref-knuth1987mathematical"/>
+    <w:bookmarkStart w:id="65" w:name="refs"/>
+    <w:bookmarkStart w:id="62" w:name="ref-halmos1970write"/>
+    <w:p>
+      <w:pPr>
+        <w:pStyle w:val="Bibliography"/>
+      </w:pPr>
+      <w:r>
+        <w:t xml:space="preserve">Halmos, Paul R. 1970.</w:t>
+      </w:r>
+      <w:r>
+        <w:t xml:space="preserve"> </w:t>
+      </w:r>
+      <w:r>
+        <w:t xml:space="preserve">“How to Write Mathematics.”</w:t>
+      </w:r>
+      <w:r>
+        <w:t xml:space="preserve"> </w:t>
+      </w:r>
+      <w:r>
+        <w:rPr>
+          <w:i/>
+          <w:iCs/>
+        </w:rPr>
+        <w:t xml:space="preserve">L’Enseignement Math</w:t>
+      </w:r>
+      <w:r>
+        <w:rPr>
+          <w:i/>
+          <w:iCs/>
+        </w:rPr>
+        <w:t xml:space="preserve">é</w:t>
+      </w:r>
+      <w:r>
+        <w:rPr>
+          <w:i/>
+          <w:iCs/>
+        </w:rPr>
+        <w:t xml:space="preserve">matique</w:t>
+      </w:r>
+      <w:r>
+        <w:t xml:space="preserve"> </w:t>
+      </w:r>
+      <w:r>
+        <w:t xml:space="preserve">16.</w:t>
+      </w:r>
+      <w:r>
+        <w:t xml:space="preserve"> </w:t>
+      </w:r>
+      <w:hyperlink r:id="rId61">
+        <w:r>
+          <w:rPr>
+            <w:rStyle w:val="Hyperlink"/>
+          </w:rPr>
+          <w:t xml:space="preserve">https://doi.org/10.5169/seals-43857</w:t>
+        </w:r>
+      </w:hyperlink>
+      <w:r>
+        <w:t xml:space="preserve">.</w:t>
+      </w:r>
+    </w:p>
+    <w:bookmarkEnd w:id="62"/>
+    <w:bookmarkStart w:id="64" w:name="ref-knuth1987mathematical"/>
     <w:p>
       <w:pPr>
         <w:pStyle w:val="Bibliography"/>
@@ -4040,7 +4766,7 @@
       <w:r>
         <w:t xml:space="preserve"> </w:t>
       </w:r>
-      <w:hyperlink r:id="rId51">
+      <w:hyperlink r:id="rId63">
         <w:r>
           <w:rPr>
             <w:rStyle w:val="Hyperlink"/>
@@ -4052,9 +4778,9 @@
         <w:t xml:space="preserve">.</w:t>
       </w:r>
     </w:p>
-    <w:bookmarkEnd w:id="52"/>
-    <w:bookmarkEnd w:id="53"/>
-    <w:bookmarkEnd w:id="54"/>
+    <w:bookmarkEnd w:id="64"/>
+    <w:bookmarkEnd w:id="65"/>
+    <w:bookmarkEnd w:id="66"/>
     <w:sectPr>
       <w:footnotePr>
         <w:numRestart w:val="eachSect"/>

</xml_diff>

<commit_message>
Deploying to gh-pages from @ Morrison-Lab/psw@4aaaf95748b462bfd28ec785d6045541cad6b1b6 🚀
</commit_message>
<xml_diff>
--- a/chapters/mathematical-writing.docx
+++ b/chapters/mathematical-writing.docx
@@ -15,7 +15,7 @@
         <w:pStyle w:val="Date"/>
       </w:pPr>
       <w:r>
-        <w:t xml:space="preserve">Last modified: 2026-10-29 17:02:18 (PDT)</w:t>
+        <w:t xml:space="preserve">Last modified: 2026-10-29 18:12:52 (PDT)</w:t>
       </w:r>
     </w:p>
     <w:tbl>
@@ -4297,13 +4297,407 @@
       </w:r>
     </w:p>
     <w:bookmarkEnd w:id="52"/>
-    <w:bookmarkStart w:id="66" w:name="rules-that-other-chapters-cover"/>
+    <w:bookmarkStart w:id="56" w:name="state-a-theorem-in-one-short-sentence"/>
     <w:p>
       <w:pPr>
         <w:pStyle w:val="Heading2"/>
       </w:pPr>
       <w:r>
-        <w:t xml:space="preserve">12 Rules that other chapters cover</w:t>
+        <w:t xml:space="preserve">12 State a theorem in one short sentence</w:t>
+      </w:r>
+    </w:p>
+    <w:p>
+      <w:pPr>
+        <w:pStyle w:val="FirstParagraph"/>
+      </w:pPr>
+      <w:r>
+        <w:t xml:space="preserve">Halmos advises that</w:t>
+      </w:r>
+      <w:r>
+        <w:t xml:space="preserve"> </w:t>
+      </w:r>
+      <w:r>
+        <w:t xml:space="preserve">“the statement of the theorem should consist of one sentence whenever possible”</w:t>
+      </w:r>
+      <w:r>
+        <w:t xml:space="preserve">,</w:t>
+      </w:r>
+      <w:r>
+        <w:t xml:space="preserve"> </w:t>
+      </w:r>
+      <w:r>
+        <w:t xml:space="preserve">and that the sentence be a short one</w:t>
+      </w:r>
+      <w:r>
+        <w:t xml:space="preserve"> </w:t>
+      </w:r>
+      <w:r>
+        <w:t xml:space="preserve">(Halmos 1970, sec. 10)</w:t>
+      </w:r>
+      <w:r>
+        <w:t xml:space="preserve">.</w:t>
+      </w:r>
+      <w:r>
+        <w:t xml:space="preserve"> </w:t>
+      </w:r>
+      <w:r>
+        <w:t xml:space="preserve">Put the introductory comments, preliminary definitions and motivation before the statement,</w:t>
+      </w:r>
+      <w:r>
+        <w:t xml:space="preserve"> </w:t>
+      </w:r>
+      <w:r>
+        <w:t xml:space="preserve">and the proof after it.</w:t>
+      </w:r>
+      <w:r>
+        <w:t xml:space="preserve"> </w:t>
+      </w:r>
+      <w:r>
+        <w:t xml:space="preserve">Leave asides out of the statement itself.</w:t>
+      </w:r>
+      <w:r>
+        <w:t xml:space="preserve"> </w:t>
+      </w:r>
+      <w:r>
+        <w:t xml:space="preserve">Halmos says that phrases such as</w:t>
+      </w:r>
+      <w:r>
+        <w:t xml:space="preserve"> </w:t>
+      </w:r>
+      <w:r>
+        <w:t xml:space="preserve">“without loss of generality we may assume …”</w:t>
+      </w:r>
+      <w:r>
+        <w:t xml:space="preserve"> </w:t>
+      </w:r>
+      <w:r>
+        <w:t xml:space="preserve">and</w:t>
+      </w:r>
+      <w:r>
+        <w:t xml:space="preserve"> </w:t>
+      </w:r>
+      <w:r>
+        <w:t xml:space="preserve">“moreover it follows from Theorem 1 that …”</w:t>
+      </w:r>
+      <w:r>
+        <w:t xml:space="preserve"> </w:t>
+      </w:r>
+      <w:r>
+        <w:t xml:space="preserve">do not belong in the statement of a theorem</w:t>
+      </w:r>
+      <w:r>
+        <w:t xml:space="preserve"> </w:t>
+      </w:r>
+      <w:r>
+        <w:t xml:space="preserve">(Halmos 1970, sec. 10)</w:t>
+      </w:r>
+      <w:r>
+        <w:t xml:space="preserve">.</w:t>
+      </w:r>
+      <w:r>
+        <w:t xml:space="preserve"> </w:t>
+      </w:r>
+      <w:r>
+        <w:t xml:space="preserve">A reasoning word in a statement (</w:t>
+      </w:r>
+      <w:r>
+        <w:t xml:space="preserve">“so”</w:t>
+      </w:r>
+      <w:r>
+        <w:t xml:space="preserve">,</w:t>
+      </w:r>
+      <w:r>
+        <w:t xml:space="preserve"> </w:t>
+      </w:r>
+      <w:r>
+        <w:t xml:space="preserve">“because”</w:t>
+      </w:r>
+      <w:r>
+        <w:t xml:space="preserve">) is a separate fault,</w:t>
+      </w:r>
+      <w:r>
+        <w:t xml:space="preserve"> </w:t>
+      </w:r>
+      <w:r>
+        <w:t xml:space="preserve">and</w:t>
+      </w:r>
+      <w:r>
+        <w:t xml:space="preserve"> </w:t>
+      </w:r>
+      <w:hyperlink r:id="rId53">
+        <w:r>
+          <w:rPr>
+            <w:rStyle w:val="Hyperlink"/>
+          </w:rPr>
+          <w:t xml:space="preserve">Build every unit from smaller atomic units</w:t>
+        </w:r>
+      </w:hyperlink>
+      <w:r>
+        <w:t xml:space="preserve"> </w:t>
+      </w:r>
+      <w:r>
+        <w:t xml:space="preserve">covers it.</w:t>
+      </w:r>
+    </w:p>
+    <w:bookmarkStart w:id="54" w:name="exm-one-sentence-statement"/>
+    <w:p>
+      <w:pPr>
+        <w:pStyle w:val="BodyText"/>
+      </w:pPr>
+      <w:r>
+        <w:rPr>
+          <w:b/>
+          <w:bCs/>
+        </w:rPr>
+        <w:t xml:space="preserve">Example 12 (Moving an aside out of a statement)</w:t>
+      </w:r>
+      <w:r>
+        <w:t xml:space="preserve"> </w:t>
+      </w:r>
+      <w:r>
+        <w:t xml:space="preserve"> </w:t>
+      </w:r>
+    </w:p>
+    <w:p>
+      <w:pPr>
+        <w:pStyle w:val="BlockText"/>
+      </w:pPr>
+      <w:r>
+        <w:t xml:space="preserve">❌ Without loss of generality, let</w:t>
+      </w:r>
+      <w:r>
+        <w:t xml:space="preserve"> </w:t>
+      </w:r>
+      <m:oMath>
+        <m:r>
+          <m:t>x</m:t>
+        </m:r>
+        <m:r>
+          <m:rPr>
+            <m:sty m:val="p"/>
+          </m:rPr>
+          <m:t>&gt;</m:t>
+        </m:r>
+        <m:r>
+          <m:t>0</m:t>
+        </m:r>
+      </m:oMath>
+      <w:r>
+        <w:t xml:space="preserve">.</w:t>
+      </w:r>
+      <w:r>
+        <w:t xml:space="preserve"> </w:t>
+      </w:r>
+      <w:r>
+        <w:t xml:space="preserve">Moreover, the sequence converges.</w:t>
+      </w:r>
+    </w:p>
+    <w:p>
+      <w:pPr>
+        <w:pStyle w:val="BlockText"/>
+      </w:pPr>
+      <w:r>
+        <w:t xml:space="preserve">✅ If</w:t>
+      </w:r>
+      <w:r>
+        <w:t xml:space="preserve"> </w:t>
+      </w:r>
+      <m:oMath>
+        <m:r>
+          <m:t>x</m:t>
+        </m:r>
+        <m:r>
+          <m:rPr>
+            <m:sty m:val="p"/>
+          </m:rPr>
+          <m:t>&gt;</m:t>
+        </m:r>
+        <m:r>
+          <m:t>0</m:t>
+        </m:r>
+      </m:oMath>
+      <w:r>
+        <w:t xml:space="preserve">, then the sequence converges.</w:t>
+      </w:r>
+    </w:p>
+    <w:p>
+      <w:pPr>
+        <w:pStyle w:val="FirstParagraph"/>
+      </w:pPr>
+      <w:r>
+        <w:t xml:space="preserve">The ❌ statement is two sentences, and the first one is an aside.</w:t>
+      </w:r>
+      <w:r>
+        <w:t xml:space="preserve"> </w:t>
+      </w:r>
+      <w:r>
+        <w:t xml:space="preserve">The ✅ statement is one implication.</w:t>
+      </w:r>
+      <w:r>
+        <w:t xml:space="preserve"> </w:t>
+      </w:r>
+      <w:r>
+        <w:t xml:space="preserve">If the case</w:t>
+      </w:r>
+      <w:r>
+        <w:t xml:space="preserve"> </w:t>
+      </w:r>
+      <m:oMath>
+        <m:r>
+          <m:t>x</m:t>
+        </m:r>
+        <m:r>
+          <m:rPr>
+            <m:sty m:val="p"/>
+          </m:rPr>
+          <m:t>&lt;</m:t>
+        </m:r>
+        <m:r>
+          <m:t>0</m:t>
+        </m:r>
+      </m:oMath>
+      <w:r>
+        <w:t xml:space="preserve"> </w:t>
+      </w:r>
+      <w:r>
+        <w:t xml:space="preserve">needs the same argument, say so in the proof.</w:t>
+      </w:r>
+    </w:p>
+    <w:bookmarkEnd w:id="54"/>
+    <w:p>
+      <w:pPr>
+        <w:pStyle w:val="BodyText"/>
+      </w:pPr>
+      <w:r>
+        <w:t xml:space="preserve">A statement that lists many hypotheses and many conclusions is too long for one sentence.</w:t>
+      </w:r>
+      <w:r>
+        <w:t xml:space="preserve"> </w:t>
+      </w:r>
+      <w:r>
+        <w:t xml:space="preserve">Halmos says that</w:t>
+      </w:r>
+      <w:r>
+        <w:t xml:space="preserve"> </w:t>
+      </w:r>
+      <w:r>
+        <w:t xml:space="preserve">“a list of eight hypotheses … and a list of six conclusions do not a theorem make;</w:t>
+      </w:r>
+      <w:r>
+        <w:t xml:space="preserve"> </w:t>
+      </w:r>
+      <w:r>
+        <w:t xml:space="preserve">they are a badly expounded theory”</w:t>
+      </w:r>
+      <w:r>
+        <w:t xml:space="preserve">,</w:t>
+      </w:r>
+      <w:r>
+        <w:t xml:space="preserve"> </w:t>
+      </w:r>
+      <w:r>
+        <w:t xml:space="preserve">and that the hypotheses</w:t>
+      </w:r>
+      <w:r>
+        <w:t xml:space="preserve"> </w:t>
+      </w:r>
+      <w:r>
+        <w:t xml:space="preserve">“probably describe a general concept that deserves to be isolated, named, and studied”</w:t>
+      </w:r>
+      <w:r>
+        <w:t xml:space="preserve"> </w:t>
+      </w:r>
+      <w:r>
+        <w:t xml:space="preserve">(Halmos 1970, sec. 10)</w:t>
+      </w:r>
+      <w:r>
+        <w:t xml:space="preserve">.</w:t>
+      </w:r>
+      <w:r>
+        <w:t xml:space="preserve"> </w:t>
+      </w:r>
+      <w:r>
+        <w:t xml:space="preserve">Name the shared concept in its own definition,</w:t>
+      </w:r>
+      <w:r>
+        <w:t xml:space="preserve"> </w:t>
+      </w:r>
+      <w:r>
+        <w:t xml:space="preserve">and state each conclusion as its own result.</w:t>
+      </w:r>
+    </w:p>
+    <w:p>
+      <w:pPr>
+        <w:pStyle w:val="BodyText"/>
+      </w:pPr>
+      <w:r>
+        <w:t xml:space="preserve">A warn-only check (</w:t>
+      </w:r>
+      <w:hyperlink r:id="rId55">
+        <w:r>
+          <w:rPr>
+            <w:rStyle w:val="Hyperlink"/>
+          </w:rPr>
+          <w:t xml:space="preserve">gha#1368</w:t>
+        </w:r>
+      </w:hyperlink>
+      <w:r>
+        <w:t xml:space="preserve">) flags</w:t>
+      </w:r>
+      <w:r>
+        <w:t xml:space="preserve"> </w:t>
+      </w:r>
+      <w:r>
+        <w:t xml:space="preserve">“without loss of generality”</w:t>
+      </w:r>
+      <w:r>
+        <w:t xml:space="preserve">,</w:t>
+      </w:r>
+      <w:r>
+        <w:t xml:space="preserve"> </w:t>
+      </w:r>
+      <w:r>
+        <w:t xml:space="preserve">“moreover”</w:t>
+      </w:r>
+      <w:r>
+        <w:t xml:space="preserve"> </w:t>
+      </w:r>
+      <w:r>
+        <w:t xml:space="preserve">and</w:t>
+      </w:r>
+      <w:r>
+        <w:t xml:space="preserve"> </w:t>
+      </w:r>
+      <w:r>
+        <w:t xml:space="preserve">“furthermore”</w:t>
+      </w:r>
+      <w:r>
+        <w:t xml:space="preserve"> </w:t>
+      </w:r>
+      <w:r>
+        <w:t xml:space="preserve">on a line that a pull request adds to a theorem statement.</w:t>
+      </w:r>
+      <w:r>
+        <w:t xml:space="preserve"> </w:t>
+      </w:r>
+      <w:r>
+        <w:t xml:space="preserve">No check can measure whether a statement is short or whether its hypotheses form a concept,</w:t>
+      </w:r>
+      <w:r>
+        <w:t xml:space="preserve"> </w:t>
+      </w:r>
+      <w:r>
+        <w:t xml:space="preserve">so the length rule stays a writing rule that review enforces.</w:t>
+      </w:r>
+    </w:p>
+    <w:bookmarkEnd w:id="56"/>
+    <w:bookmarkStart w:id="70" w:name="rules-that-other-chapters-cover"/>
+    <w:p>
+      <w:pPr>
+        <w:pStyle w:val="Heading2"/>
+      </w:pPr>
+      <w:r>
+        <w:t xml:space="preserve">13 Rules that other chapters cover</w:t>
       </w:r>
     </w:p>
     <w:p>
@@ -4338,7 +4732,7 @@
       <w:tr>
         <w:tc>
           <w:tcPr/>
-          <w:bookmarkStart w:id="60" w:name="tbl-knuth-elsewhere"/>
+          <w:bookmarkStart w:id="64" w:name="tbl-knuth-elsewhere"/>
           <w:p>
             <w:pPr>
               <w:jc w:val="center"/>
@@ -4474,7 +4868,7 @@
                     <w:pStyle w:val="Compact"/>
                     <w:jc w:val="center"/>
                   </w:pPr>
-                  <w:hyperlink r:id="rId53">
+                  <w:hyperlink r:id="rId57">
                     <w:r>
                       <w:rPr>
                         <w:rStyle w:val="Hyperlink"/>
@@ -4505,7 +4899,7 @@
                     <w:pStyle w:val="Compact"/>
                     <w:jc w:val="center"/>
                   </w:pPr>
-                  <w:hyperlink r:id="rId54">
+                  <w:hyperlink r:id="rId58">
                     <w:r>
                       <w:rPr>
                         <w:rStyle w:val="Hyperlink"/>
@@ -4536,7 +4930,7 @@
                     <w:pStyle w:val="Compact"/>
                     <w:jc w:val="center"/>
                   </w:pPr>
-                  <w:hyperlink r:id="rId55">
+                  <w:hyperlink r:id="rId59">
                     <w:r>
                       <w:rPr>
                         <w:rStyle w:val="Hyperlink"/>
@@ -4567,7 +4961,7 @@
                     <w:pStyle w:val="Compact"/>
                     <w:jc w:val="center"/>
                   </w:pPr>
-                  <w:hyperlink r:id="rId56">
+                  <w:hyperlink r:id="rId60">
                     <w:r>
                       <w:rPr>
                         <w:rStyle w:val="Hyperlink"/>
@@ -4616,7 +5010,7 @@
                   <w:r>
                     <w:t xml:space="preserve"> </w:t>
                   </w:r>
-                  <w:hyperlink r:id="rId57">
+                  <w:hyperlink r:id="rId61">
                     <w:r>
                       <w:rPr>
                         <w:rStyle w:val="Hyperlink"/>
@@ -4633,7 +5027,7 @@
                     <w:pStyle w:val="Compact"/>
                     <w:jc w:val="center"/>
                   </w:pPr>
-                  <w:hyperlink r:id="rId58">
+                  <w:hyperlink r:id="rId62">
                     <w:r>
                       <w:rPr>
                         <w:rStyle w:val="Hyperlink"/>
@@ -4664,7 +5058,7 @@
                     <w:pStyle w:val="Compact"/>
                     <w:jc w:val="center"/>
                   </w:pPr>
-                  <w:hyperlink r:id="rId59">
+                  <w:hyperlink r:id="rId63">
                     <w:r>
                       <w:rPr>
                         <w:rStyle w:val="Hyperlink"/>
@@ -4676,13 +5070,13 @@
               </w:tc>
             </w:tr>
           </w:tbl>
-          <w:bookmarkEnd w:id="60"/>
+          <w:bookmarkEnd w:id="64"/>
           <w:p/>
         </w:tc>
       </w:tr>
     </w:tbl>
-    <w:bookmarkStart w:id="65" w:name="refs"/>
-    <w:bookmarkStart w:id="62" w:name="ref-halmos1970write"/>
+    <w:bookmarkStart w:id="69" w:name="refs"/>
+    <w:bookmarkStart w:id="66" w:name="ref-halmos1970write"/>
     <w:p>
       <w:pPr>
         <w:pStyle w:val="Bibliography"/>
@@ -4729,7 +5123,7 @@
       <w:r>
         <w:t xml:space="preserve"> </w:t>
       </w:r>
-      <w:hyperlink r:id="rId61">
+      <w:hyperlink r:id="rId65">
         <w:r>
           <w:rPr>
             <w:rStyle w:val="Hyperlink"/>
@@ -4741,8 +5135,8 @@
         <w:t xml:space="preserve">.</w:t>
       </w:r>
     </w:p>
-    <w:bookmarkEnd w:id="62"/>
-    <w:bookmarkStart w:id="64" w:name="ref-knuth1987mathematical"/>
+    <w:bookmarkEnd w:id="66"/>
+    <w:bookmarkStart w:id="68" w:name="ref-knuth1987mathematical"/>
     <w:p>
       <w:pPr>
         <w:pStyle w:val="Bibliography"/>
@@ -4766,7 +5160,7 @@
       <w:r>
         <w:t xml:space="preserve"> </w:t>
       </w:r>
-      <w:hyperlink r:id="rId63">
+      <w:hyperlink r:id="rId67">
         <w:r>
           <w:rPr>
             <w:rStyle w:val="Hyperlink"/>
@@ -4778,9 +5172,9 @@
         <w:t xml:space="preserve">.</w:t>
       </w:r>
     </w:p>
-    <w:bookmarkEnd w:id="64"/>
-    <w:bookmarkEnd w:id="65"/>
-    <w:bookmarkEnd w:id="66"/>
+    <w:bookmarkEnd w:id="68"/>
+    <w:bookmarkEnd w:id="69"/>
+    <w:bookmarkEnd w:id="70"/>
     <w:sectPr>
       <w:footnotePr>
         <w:numRestart w:val="eachSect"/>

</xml_diff>